<commit_message>
Separate pure holding companies into per-team 지주 sectors
두산·LS 등 순수지주가 자회사와 같은 섹터에 섞여 있어 분석 틀과 룩스루가
뒤엉켰다. 소속 팀 안에서 「지주」로 분리한다.

분리 근거
- 주가 동인이 NAV 할인율·지배구조·주주환원이라 사업회사와 분석 틀이 다르다
- 자회사와 중복 노출이 발생한다 (두산↔두산에너빌리티, LS↔LS ELECTRIC,
  HD현대↔HD현대중공업, SK스퀘어↔SK하이닉스 룩스루 1.8배)
- 팀을 가로질러 묶으면 합산 노출을 아무도 안 보게 되므로 팀 안에서 분리했다

경계
- 사업 실질이 주력인 지주(POSCO홀딩스·OCI홀딩스·세아베스틸지주)는 사업 섹터에 유지
- 금융지주(KB·신한·하나·우리 등)는 은행 그 자체이므로 금융에 유지

파생 조정
- 지주 분리로 작아진 소재·화학·철강(1.98%)과 에너지·상사·운송(1.67%)을
  「소재·에너지」로 통합 — 팀2를 7개 → 6개 산업으로 환원
- 세 팀 모두 6개 산업. 팀 예산(16.98/16.86/15.71%)은 팀 내 이동이라 불변

MANDATE·BANK·split_sectors를 sector_map.py로 모아 weights.py·
make_screening_book.py·make_slot_sheet.py가 공유하도록 정리했다.

Co-Authored-By: Claude Opus 5 <noreply@anthropic.com>
Claude-Session: https://claude.ai/code/session_014jphTyMQLHbxpFNoQ68jkL
</commit_message>
<xml_diff>
--- a/docs/26-2/templates/ICOK_담당산업_배정시트_20260915.docx
+++ b/docs/26-2/templates/ICOK_담당산업_배정시트_20260915.docx
@@ -248,7 +248,7 @@
                 <w:b w:val="0"/>
                 <w:sz w:val="18"/>
               </w:rPr>
-              <w:t>3.71%</w:t>
+              <w:t>3.66%</w:t>
             </w:r>
           </w:p>
         </w:tc>
@@ -268,7 +268,7 @@
                 <w:b w:val="0"/>
                 <w:sz w:val="18"/>
               </w:rPr>
-              <w:t>1,037,465원</w:t>
+              <w:t>1,025,388원</w:t>
             </w:r>
           </w:p>
         </w:tc>
@@ -288,7 +288,7 @@
                 <w:b w:val="0"/>
                 <w:sz w:val="18"/>
               </w:rPr>
-              <w:t>12</w:t>
+              <w:t>11</w:t>
             </w:r>
           </w:p>
         </w:tc>
@@ -639,7 +639,7 @@
                 <w:b/>
                 <w:sz w:val="18"/>
               </w:rPr>
-              <w:t>지주(반도체 프록시)</w:t>
+              <w:t>지주 — 테크·전동화</w:t>
             </w:r>
           </w:p>
         </w:tc>
@@ -659,7 +659,7 @@
                 <w:b w:val="0"/>
                 <w:sz w:val="18"/>
               </w:rPr>
-              <w:t>2.48%</w:t>
+              <w:t>2.64%</w:t>
             </w:r>
           </w:p>
         </w:tc>
@@ -679,7 +679,7 @@
                 <w:b w:val="0"/>
                 <w:sz w:val="18"/>
               </w:rPr>
-              <w:t>693,542원</w:t>
+              <w:t>739,200원</w:t>
             </w:r>
           </w:p>
         </w:tc>
@@ -699,7 +699,7 @@
                 <w:b w:val="0"/>
                 <w:sz w:val="18"/>
               </w:rPr>
-              <w:t>1</w:t>
+              <w:t>5</w:t>
             </w:r>
           </w:p>
         </w:tc>
@@ -719,7 +719,7 @@
                 <w:b w:val="0"/>
                 <w:sz w:val="18"/>
               </w:rPr>
-              <w:t>1,000,000원</w:t>
+              <w:t>24,200원</w:t>
             </w:r>
           </w:p>
         </w:tc>
@@ -796,7 +796,7 @@
                 <w:b w:val="0"/>
                 <w:sz w:val="18"/>
               </w:rPr>
-              <w:t>2.39%</w:t>
+              <w:t>2.27%</w:t>
             </w:r>
           </w:p>
         </w:tc>
@@ -816,7 +816,7 @@
                 <w:b w:val="0"/>
                 <w:sz w:val="18"/>
               </w:rPr>
-              <w:t>669,422원</w:t>
+              <w:t>635,841원</w:t>
             </w:r>
           </w:p>
         </w:tc>
@@ -836,7 +836,7 @@
                 <w:b w:val="0"/>
                 <w:sz w:val="18"/>
               </w:rPr>
-              <w:t>41</w:t>
+              <w:t>38</w:t>
             </w:r>
           </w:p>
         </w:tc>
@@ -1199,7 +1199,7 @@
                 <w:b/>
                 <w:sz w:val="16"/>
               </w:rPr>
-              <w:t>지주(반도체 프록시)</w:t>
+              <w:t>지주 — 테크·전동화</w:t>
             </w:r>
           </w:p>
         </w:tc>
@@ -1218,7 +1218,7 @@
                 <w:b w:val="0"/>
                 <w:sz w:val="16"/>
               </w:rPr>
-              <w:t>SK스퀘어 1,000,000원(2.48%)</w:t>
+              <w:t>SK스퀘어 1,000,000원(2.48%)  피에스케이홀딩스 166,900원(0.07%)  한국앤컴퍼니 24,200원(0.04%)  원익홀딩스 25,050원(0.04%)  솔브레인홀딩스 41,650원(0.02%)</w:t>
             </w:r>
           </w:p>
         </w:tc>
@@ -1332,7 +1332,7 @@
           <w:b w:val="0"/>
           <w:sz w:val="18"/>
         </w:rPr>
-        <w:t>지주(SK스퀘어)는 종목이 1개이고 SK하이닉스 룩스루 1.8배라 팀장이 직접 관리합니다. 6번째 인원은 반도체·소부장을 전공정(장비·소재) / 후공정(기판·테스트)으로 나눠 맡습니다.</w:t>
+        <w:t>담당 산업 6개, 인원 6명으로 1인 1산업이다. 순수지주는 「지주」로 따로 묶었다 — SK스퀘어는 SK하이닉스 룩스루 배수가 1.8배이므로 편입 시 펀드 전체 노출을 함께 계산한다.</w:t>
       </w:r>
     </w:p>
     <w:p>
@@ -1345,7 +1345,7 @@
           <w:b/>
           <w:sz w:val="20"/>
         </w:rPr>
-        <w:t>다음 주 과제 — 담당 산업 스크리닝 (A4 1~2장, 세션 전날 자정)</w:t>
+        <w:t>과제 — 담당 산업 스크리닝  (A4 1~2장 · 마감 9월 22일 세션 전날 자정)</w:t>
       </w:r>
     </w:p>
     <w:p>
@@ -1358,7 +1358,7 @@
           <w:b w:val="0"/>
           <w:sz w:val="18"/>
         </w:rPr>
-        <w:t>1.  담당 산업 전 종목을 3개 지표로 줄 세운다 — 3개년 매출 CAGR · 최근 4분기 평균 OPM · ROE</w:t>
+        <w:t>1.  담당 산업 전 종목을 매출 CAGR(3년) · 영업이익률 · ROE 세 지표로 줄 세운다.</w:t>
       </w:r>
     </w:p>
     <w:p>
@@ -1371,7 +1371,7 @@
           <w:b w:val="0"/>
           <w:sz w:val="18"/>
         </w:rPr>
-        <w:t xml:space="preserve">     모든 숫자에 출처와 기준일을 단다. DART 사업보고서를 1순위로 쓴다.</w:t>
+        <w:t xml:space="preserve">     모든 수치에 출처와 기준일을 기재한다. 1순위 자료는 DART 사업보고서다.</w:t>
       </w:r>
     </w:p>
     <w:p>
@@ -1384,7 +1384,7 @@
           <w:b w:val="0"/>
           <w:sz w:val="18"/>
         </w:rPr>
-        <w:t>2.  상위 3종목을 고르고 각각 두 줄로 근거를 쓴다.</w:t>
+        <w:t>2.  상위 3종목을 선정하고 각각 두 줄로 근거를 기재한다.</w:t>
       </w:r>
     </w:p>
     <w:p>
@@ -1397,7 +1397,7 @@
           <w:b w:val="0"/>
           <w:sz w:val="18"/>
         </w:rPr>
-        <w:t>3.  탈락 5종목과 뺀 이유를 한 줄씩 쓴다.  "지표가 나빠서"는 사유가 아니다.</w:t>
+        <w:t>3.  탈락 5종목과 사유를 한 줄씩 기재한다. 해당 지표와 수치를 명시한다.</w:t>
       </w:r>
     </w:p>
     <w:p>
@@ -1410,7 +1410,20 @@
           <w:b w:val="0"/>
           <w:sz w:val="18"/>
         </w:rPr>
-        <w:t>4.  1주 가격을 확인한다 — 1주가 팀 예산의 20%를 넘는 종목을 표시한다.</w:t>
+        <w:t>4.  1주 가격이 팀 예산의 20%를 초과하는 종목을 표시한다.</w:t>
+      </w:r>
+    </w:p>
+    <w:p>
+      <w:pPr>
+        <w:spacing w:after="20" w:before="0"/>
+      </w:pPr>
+      <w:r>
+        <w:rPr>
+          <w:rFonts w:ascii="맑은 고딕" w:hAnsi="맑은 고딕" w:eastAsia="맑은 고딕"/>
+          <w:b w:val="0"/>
+          <w:sz w:val="18"/>
+        </w:rPr>
+        <w:t>5.  지주를 검토할 때는 같은 팀이 보유한 자회사와의 합산 노출을 함께 확인한다.</w:t>
       </w:r>
     </w:p>
     <w:p>
@@ -1423,7 +1436,7 @@
           <w:b/>
           <w:sz w:val="18"/>
         </w:rPr>
-        <w:t>금지 — 증권사 리포트를 논지의 근거로 쓰지 않는다. 목표주가를 인용하지 않는다.</w:t>
+        <w:t>증권사 리포트를 논지의 근거로 사용하지 않는다. 목표주가를 인용하지 않는다.</w:t>
       </w:r>
     </w:p>
     <w:p>
@@ -1437,7 +1450,7 @@
           <w:color w:val="990011"/>
           <w:sz w:val="18"/>
         </w:rPr>
-        <w:t>여기서 고른 3종목 중 하나를 10월 13일에 발제한다. 효성중공업(2,689,000원 · BM 0.47%)은 1주만 사도 한도를 넘어 매수할 수 없다.</w:t>
+        <w:t>스크리닝 결과로 팀 미니 IC에서 1라운드 발표 섹터를 정한다.  효성중공업(2,689,000원 · 지수 비중 0.47%)은 1주 매수만으로 한도를 초과한다.</w:t>
       </w:r>
     </w:p>
     <w:p>
@@ -1676,6 +1689,143 @@
                 <w:b/>
                 <w:sz w:val="18"/>
               </w:rPr>
+              <w:t>소재·에너지</w:t>
+            </w:r>
+          </w:p>
+        </w:tc>
+        <w:tc>
+          <w:tcPr>
+            <w:tcW w:type="dxa" w:w="907"/>
+          </w:tcPr>
+          <w:p>
+            <w:pPr>
+              <w:spacing w:after="0" w:before="0"/>
+              <w:jc w:val="center"/>
+            </w:pPr>
+            <w:r/>
+            <w:r>
+              <w:rPr>
+                <w:rFonts w:ascii="맑은 고딕" w:hAnsi="맑은 고딕" w:eastAsia="맑은 고딕"/>
+                <w:b w:val="0"/>
+                <w:sz w:val="18"/>
+              </w:rPr>
+              <w:t>3.66%</w:t>
+            </w:r>
+          </w:p>
+        </w:tc>
+        <w:tc>
+          <w:tcPr>
+            <w:tcW w:type="dxa" w:w="1304"/>
+          </w:tcPr>
+          <w:p>
+            <w:pPr>
+              <w:spacing w:after="0" w:before="0"/>
+              <w:jc w:val="right"/>
+            </w:pPr>
+            <w:r/>
+            <w:r>
+              <w:rPr>
+                <w:rFonts w:ascii="맑은 고딕" w:hAnsi="맑은 고딕" w:eastAsia="맑은 고딕"/>
+                <w:b w:val="0"/>
+                <w:sz w:val="18"/>
+              </w:rPr>
+              <w:t>1,024,046원</w:t>
+            </w:r>
+          </w:p>
+        </w:tc>
+        <w:tc>
+          <w:tcPr>
+            <w:tcW w:type="dxa" w:w="680"/>
+          </w:tcPr>
+          <w:p>
+            <w:pPr>
+              <w:spacing w:after="0" w:before="0"/>
+              <w:jc w:val="center"/>
+            </w:pPr>
+            <w:r/>
+            <w:r>
+              <w:rPr>
+                <w:rFonts w:ascii="맑은 고딕" w:hAnsi="맑은 고딕" w:eastAsia="맑은 고딕"/>
+                <w:b w:val="0"/>
+                <w:sz w:val="18"/>
+              </w:rPr>
+              <w:t>27</w:t>
+            </w:r>
+          </w:p>
+        </w:tc>
+        <w:tc>
+          <w:tcPr>
+            <w:tcW w:type="dxa" w:w="1134"/>
+          </w:tcPr>
+          <w:p>
+            <w:pPr>
+              <w:spacing w:after="0" w:before="0"/>
+              <w:jc w:val="right"/>
+            </w:pPr>
+            <w:r/>
+            <w:r>
+              <w:rPr>
+                <w:rFonts w:ascii="맑은 고딕" w:hAnsi="맑은 고딕" w:eastAsia="맑은 고딕"/>
+                <w:b w:val="0"/>
+                <w:sz w:val="18"/>
+              </w:rPr>
+              <w:t>5,680원</w:t>
+            </w:r>
+          </w:p>
+        </w:tc>
+        <w:tc>
+          <w:tcPr>
+            <w:tcW w:type="dxa" w:w="907"/>
+          </w:tcPr>
+          <w:p>
+            <w:pPr>
+              <w:spacing w:after="0" w:before="0"/>
+            </w:pPr>
+            <w:r/>
+            <w:r>
+              <w:rPr>
+                <w:rFonts w:ascii="맑은 고딕" w:hAnsi="맑은 고딕" w:eastAsia="맑은 고딕"/>
+                <w:b w:val="0"/>
+                <w:sz w:val="18"/>
+              </w:rPr>
+            </w:r>
+          </w:p>
+        </w:tc>
+        <w:tc>
+          <w:tcPr>
+            <w:tcW w:type="dxa" w:w="907"/>
+          </w:tcPr>
+          <w:p>
+            <w:pPr>
+              <w:spacing w:after="0" w:before="0"/>
+            </w:pPr>
+            <w:r/>
+            <w:r>
+              <w:rPr>
+                <w:rFonts w:ascii="맑은 고딕" w:hAnsi="맑은 고딕" w:eastAsia="맑은 고딕"/>
+                <w:b w:val="0"/>
+                <w:sz w:val="18"/>
+              </w:rPr>
+            </w:r>
+          </w:p>
+        </w:tc>
+      </w:tr>
+      <w:tr>
+        <w:tc>
+          <w:tcPr>
+            <w:tcW w:type="dxa" w:w="2041"/>
+          </w:tcPr>
+          <w:p>
+            <w:pPr>
+              <w:spacing w:after="0" w:before="0"/>
+            </w:pPr>
+            <w:r/>
+            <w:r>
+              <w:rPr>
+                <w:rFonts w:ascii="맑은 고딕" w:hAnsi="맑은 고딕" w:eastAsia="맑은 고딕"/>
+                <w:b/>
+                <w:sz w:val="18"/>
+              </w:rPr>
               <w:t>전력기기·유틸리티</w:t>
             </w:r>
           </w:p>
@@ -1696,7 +1846,7 @@
                 <w:b w:val="0"/>
                 <w:sz w:val="18"/>
               </w:rPr>
-              <w:t>4.21%</w:t>
+              <w:t>3.64%</w:t>
             </w:r>
           </w:p>
         </w:tc>
@@ -1716,7 +1866,7 @@
                 <w:b w:val="0"/>
                 <w:sz w:val="18"/>
               </w:rPr>
-              <w:t>1,178,452원</w:t>
+              <w:t>1,018,935원</w:t>
             </w:r>
           </w:p>
         </w:tc>
@@ -1736,7 +1886,7 @@
                 <w:b w:val="0"/>
                 <w:sz w:val="18"/>
               </w:rPr>
-              <w:t>20</w:t>
+              <w:t>18</w:t>
             </w:r>
           </w:p>
         </w:tc>
@@ -1813,6 +1963,143 @@
                 <w:b/>
                 <w:sz w:val="18"/>
               </w:rPr>
+              <w:t>기계·건설·로봇</w:t>
+            </w:r>
+          </w:p>
+        </w:tc>
+        <w:tc>
+          <w:tcPr>
+            <w:tcW w:type="dxa" w:w="907"/>
+          </w:tcPr>
+          <w:p>
+            <w:pPr>
+              <w:spacing w:after="0" w:before="0"/>
+              <w:jc w:val="center"/>
+            </w:pPr>
+            <w:r/>
+            <w:r>
+              <w:rPr>
+                <w:rFonts w:ascii="맑은 고딕" w:hAnsi="맑은 고딕" w:eastAsia="맑은 고딕"/>
+                <w:b w:val="0"/>
+                <w:sz w:val="18"/>
+              </w:rPr>
+              <w:t>2.64%</w:t>
+            </w:r>
+          </w:p>
+        </w:tc>
+        <w:tc>
+          <w:tcPr>
+            <w:tcW w:type="dxa" w:w="1304"/>
+          </w:tcPr>
+          <w:p>
+            <w:pPr>
+              <w:spacing w:after="0" w:before="0"/>
+              <w:jc w:val="right"/>
+            </w:pPr>
+            <w:r/>
+            <w:r>
+              <w:rPr>
+                <w:rFonts w:ascii="맑은 고딕" w:hAnsi="맑은 고딕" w:eastAsia="맑은 고딕"/>
+                <w:b w:val="0"/>
+                <w:sz w:val="18"/>
+              </w:rPr>
+              <w:t>738,019원</w:t>
+            </w:r>
+          </w:p>
+        </w:tc>
+        <w:tc>
+          <w:tcPr>
+            <w:tcW w:type="dxa" w:w="680"/>
+          </w:tcPr>
+          <w:p>
+            <w:pPr>
+              <w:spacing w:after="0" w:before="0"/>
+              <w:jc w:val="center"/>
+            </w:pPr>
+            <w:r/>
+            <w:r>
+              <w:rPr>
+                <w:rFonts w:ascii="맑은 고딕" w:hAnsi="맑은 고딕" w:eastAsia="맑은 고딕"/>
+                <w:b w:val="0"/>
+                <w:sz w:val="18"/>
+              </w:rPr>
+              <w:t>19</w:t>
+            </w:r>
+          </w:p>
+        </w:tc>
+        <w:tc>
+          <w:tcPr>
+            <w:tcW w:type="dxa" w:w="1134"/>
+          </w:tcPr>
+          <w:p>
+            <w:pPr>
+              <w:spacing w:after="0" w:before="0"/>
+              <w:jc w:val="right"/>
+            </w:pPr>
+            <w:r/>
+            <w:r>
+              <w:rPr>
+                <w:rFonts w:ascii="맑은 고딕" w:hAnsi="맑은 고딕" w:eastAsia="맑은 고딕"/>
+                <w:b w:val="0"/>
+                <w:sz w:val="18"/>
+              </w:rPr>
+              <w:t>6,140원</w:t>
+            </w:r>
+          </w:p>
+        </w:tc>
+        <w:tc>
+          <w:tcPr>
+            <w:tcW w:type="dxa" w:w="907"/>
+          </w:tcPr>
+          <w:p>
+            <w:pPr>
+              <w:spacing w:after="0" w:before="0"/>
+            </w:pPr>
+            <w:r/>
+            <w:r>
+              <w:rPr>
+                <w:rFonts w:ascii="맑은 고딕" w:hAnsi="맑은 고딕" w:eastAsia="맑은 고딕"/>
+                <w:b w:val="0"/>
+                <w:sz w:val="18"/>
+              </w:rPr>
+            </w:r>
+          </w:p>
+        </w:tc>
+        <w:tc>
+          <w:tcPr>
+            <w:tcW w:type="dxa" w:w="907"/>
+          </w:tcPr>
+          <w:p>
+            <w:pPr>
+              <w:spacing w:after="0" w:before="0"/>
+            </w:pPr>
+            <w:r/>
+            <w:r>
+              <w:rPr>
+                <w:rFonts w:ascii="맑은 고딕" w:hAnsi="맑은 고딕" w:eastAsia="맑은 고딕"/>
+                <w:b w:val="0"/>
+                <w:sz w:val="18"/>
+              </w:rPr>
+            </w:r>
+          </w:p>
+        </w:tc>
+      </w:tr>
+      <w:tr>
+        <w:tc>
+          <w:tcPr>
+            <w:tcW w:type="dxa" w:w="2041"/>
+          </w:tcPr>
+          <w:p>
+            <w:pPr>
+              <w:spacing w:after="0" w:before="0"/>
+            </w:pPr>
+            <w:r/>
+            <w:r>
+              <w:rPr>
+                <w:rFonts w:ascii="맑은 고딕" w:hAnsi="맑은 고딕" w:eastAsia="맑은 고딕"/>
+                <w:b/>
+                <w:sz w:val="18"/>
+              </w:rPr>
               <w:t>조선·기자재</w:t>
             </w:r>
           </w:p>
@@ -1833,7 +2120,7 @@
                 <w:b w:val="0"/>
                 <w:sz w:val="18"/>
               </w:rPr>
-              <w:t>2.93%</w:t>
+              <w:t>2.60%</w:t>
             </w:r>
           </w:p>
         </w:tc>
@@ -1853,7 +2140,7 @@
                 <w:b w:val="0"/>
                 <w:sz w:val="18"/>
               </w:rPr>
-              <w:t>820,909원</w:t>
+              <w:t>727,472원</w:t>
             </w:r>
           </w:p>
         </w:tc>
@@ -1873,7 +2160,7 @@
                 <w:b w:val="0"/>
                 <w:sz w:val="18"/>
               </w:rPr>
-              <w:t>14</w:t>
+              <w:t>13</w:t>
             </w:r>
           </w:p>
         </w:tc>
@@ -1950,7 +2237,7 @@
                 <w:b/>
                 <w:sz w:val="18"/>
               </w:rPr>
-              <w:t>에너지·상사·운송</w:t>
+              <w:t>지주 — 산업재·인프라</w:t>
             </w:r>
           </w:p>
         </w:tc>
@@ -1970,7 +2257,7 @@
                 <w:b w:val="0"/>
                 <w:sz w:val="18"/>
               </w:rPr>
-              <w:t>2.82%</w:t>
+              <w:t>2.21%</w:t>
             </w:r>
           </w:p>
         </w:tc>
@@ -1990,7 +2277,7 @@
                 <w:b w:val="0"/>
                 <w:sz w:val="18"/>
               </w:rPr>
-              <w:t>788,218원</w:t>
+              <w:t>619,953원</w:t>
             </w:r>
           </w:p>
         </w:tc>
@@ -2010,7 +2297,7 @@
                 <w:b w:val="0"/>
                 <w:sz w:val="18"/>
               </w:rPr>
-              <w:t>13</w:t>
+              <w:t>10</w:t>
             </w:r>
           </w:p>
         </w:tc>
@@ -2030,144 +2317,7 @@
                 <w:b w:val="0"/>
                 <w:sz w:val="18"/>
               </w:rPr>
-              <w:t>5,680원</w:t>
-            </w:r>
-          </w:p>
-        </w:tc>
-        <w:tc>
-          <w:tcPr>
-            <w:tcW w:type="dxa" w:w="907"/>
-          </w:tcPr>
-          <w:p>
-            <w:pPr>
-              <w:spacing w:after="0" w:before="0"/>
-            </w:pPr>
-            <w:r/>
-            <w:r>
-              <w:rPr>
-                <w:rFonts w:ascii="맑은 고딕" w:hAnsi="맑은 고딕" w:eastAsia="맑은 고딕"/>
-                <w:b w:val="0"/>
-                <w:sz w:val="18"/>
-              </w:rPr>
-            </w:r>
-          </w:p>
-        </w:tc>
-        <w:tc>
-          <w:tcPr>
-            <w:tcW w:type="dxa" w:w="907"/>
-          </w:tcPr>
-          <w:p>
-            <w:pPr>
-              <w:spacing w:after="0" w:before="0"/>
-            </w:pPr>
-            <w:r/>
-            <w:r>
-              <w:rPr>
-                <w:rFonts w:ascii="맑은 고딕" w:hAnsi="맑은 고딕" w:eastAsia="맑은 고딕"/>
-                <w:b w:val="0"/>
-                <w:sz w:val="18"/>
-              </w:rPr>
-            </w:r>
-          </w:p>
-        </w:tc>
-      </w:tr>
-      <w:tr>
-        <w:tc>
-          <w:tcPr>
-            <w:tcW w:type="dxa" w:w="2041"/>
-          </w:tcPr>
-          <w:p>
-            <w:pPr>
-              <w:spacing w:after="0" w:before="0"/>
-            </w:pPr>
-            <w:r/>
-            <w:r>
-              <w:rPr>
-                <w:rFonts w:ascii="맑은 고딕" w:hAnsi="맑은 고딕" w:eastAsia="맑은 고딕"/>
-                <w:b/>
-                <w:sz w:val="18"/>
-              </w:rPr>
-              <w:t>기계·건설·로봇</w:t>
-            </w:r>
-          </w:p>
-        </w:tc>
-        <w:tc>
-          <w:tcPr>
-            <w:tcW w:type="dxa" w:w="907"/>
-          </w:tcPr>
-          <w:p>
-            <w:pPr>
-              <w:spacing w:after="0" w:before="0"/>
-              <w:jc w:val="center"/>
-            </w:pPr>
-            <w:r/>
-            <w:r>
-              <w:rPr>
-                <w:rFonts w:ascii="맑은 고딕" w:hAnsi="맑은 고딕" w:eastAsia="맑은 고딕"/>
-                <w:b w:val="0"/>
-                <w:sz w:val="18"/>
-              </w:rPr>
-              <w:t>2.67%</w:t>
-            </w:r>
-          </w:p>
-        </w:tc>
-        <w:tc>
-          <w:tcPr>
-            <w:tcW w:type="dxa" w:w="1304"/>
-          </w:tcPr>
-          <w:p>
-            <w:pPr>
-              <w:spacing w:after="0" w:before="0"/>
-              <w:jc w:val="right"/>
-            </w:pPr>
-            <w:r/>
-            <w:r>
-              <w:rPr>
-                <w:rFonts w:ascii="맑은 고딕" w:hAnsi="맑은 고딕" w:eastAsia="맑은 고딕"/>
-                <w:b w:val="0"/>
-                <w:sz w:val="18"/>
-              </w:rPr>
-              <w:t>747,054원</w:t>
-            </w:r>
-          </w:p>
-        </w:tc>
-        <w:tc>
-          <w:tcPr>
-            <w:tcW w:type="dxa" w:w="680"/>
-          </w:tcPr>
-          <w:p>
-            <w:pPr>
-              <w:spacing w:after="0" w:before="0"/>
-              <w:jc w:val="center"/>
-            </w:pPr>
-            <w:r/>
-            <w:r>
-              <w:rPr>
-                <w:rFonts w:ascii="맑은 고딕" w:hAnsi="맑은 고딕" w:eastAsia="맑은 고딕"/>
-                <w:b w:val="0"/>
-                <w:sz w:val="18"/>
-              </w:rPr>
-              <w:t>21</w:t>
-            </w:r>
-          </w:p>
-        </w:tc>
-        <w:tc>
-          <w:tcPr>
-            <w:tcW w:type="dxa" w:w="1134"/>
-          </w:tcPr>
-          <w:p>
-            <w:pPr>
-              <w:spacing w:after="0" w:before="0"/>
-              <w:jc w:val="right"/>
-            </w:pPr>
-            <w:r/>
-            <w:r>
-              <w:rPr>
-                <w:rFonts w:ascii="맑은 고딕" w:hAnsi="맑은 고딕" w:eastAsia="맑은 고딕"/>
-                <w:b w:val="0"/>
-                <w:sz w:val="18"/>
-              </w:rPr>
-              <w:t>6,140원</w:t>
+              <w:t>7,070원</w:t>
             </w:r>
           </w:p>
         </w:tc>
@@ -2244,7 +2394,7 @@
                 <w:b w:val="0"/>
                 <w:sz w:val="18"/>
               </w:rPr>
-              <w:t>2.25%</w:t>
+              <w:t>2.11%</w:t>
             </w:r>
           </w:p>
         </w:tc>
@@ -2264,7 +2414,7 @@
                 <w:b w:val="0"/>
                 <w:sz w:val="18"/>
               </w:rPr>
-              <w:t>629,436원</w:t>
+              <w:t>590,999원</w:t>
             </w:r>
           </w:p>
         </w:tc>
@@ -2284,7 +2434,7 @@
                 <w:b w:val="0"/>
                 <w:sz w:val="18"/>
               </w:rPr>
-              <w:t>9</w:t>
+              <w:t>8</w:t>
             </w:r>
           </w:p>
         </w:tc>
@@ -2305,143 +2455,6 @@
                 <w:sz w:val="18"/>
               </w:rPr>
               <w:t>23,150원</w:t>
-            </w:r>
-          </w:p>
-        </w:tc>
-        <w:tc>
-          <w:tcPr>
-            <w:tcW w:type="dxa" w:w="907"/>
-          </w:tcPr>
-          <w:p>
-            <w:pPr>
-              <w:spacing w:after="0" w:before="0"/>
-            </w:pPr>
-            <w:r/>
-            <w:r>
-              <w:rPr>
-                <w:rFonts w:ascii="맑은 고딕" w:hAnsi="맑은 고딕" w:eastAsia="맑은 고딕"/>
-                <w:b w:val="0"/>
-                <w:sz w:val="18"/>
-              </w:rPr>
-            </w:r>
-          </w:p>
-        </w:tc>
-        <w:tc>
-          <w:tcPr>
-            <w:tcW w:type="dxa" w:w="907"/>
-          </w:tcPr>
-          <w:p>
-            <w:pPr>
-              <w:spacing w:after="0" w:before="0"/>
-            </w:pPr>
-            <w:r/>
-            <w:r>
-              <w:rPr>
-                <w:rFonts w:ascii="맑은 고딕" w:hAnsi="맑은 고딕" w:eastAsia="맑은 고딕"/>
-                <w:b w:val="0"/>
-                <w:sz w:val="18"/>
-              </w:rPr>
-            </w:r>
-          </w:p>
-        </w:tc>
-      </w:tr>
-      <w:tr>
-        <w:tc>
-          <w:tcPr>
-            <w:tcW w:type="dxa" w:w="2041"/>
-          </w:tcPr>
-          <w:p>
-            <w:pPr>
-              <w:spacing w:after="0" w:before="0"/>
-            </w:pPr>
-            <w:r/>
-            <w:r>
-              <w:rPr>
-                <w:rFonts w:ascii="맑은 고딕" w:hAnsi="맑은 고딕" w:eastAsia="맑은 고딕"/>
-                <w:b/>
-                <w:sz w:val="18"/>
-              </w:rPr>
-              <w:t>소재·화학·철강</w:t>
-            </w:r>
-          </w:p>
-        </w:tc>
-        <w:tc>
-          <w:tcPr>
-            <w:tcW w:type="dxa" w:w="907"/>
-          </w:tcPr>
-          <w:p>
-            <w:pPr>
-              <w:spacing w:after="0" w:before="0"/>
-              <w:jc w:val="center"/>
-            </w:pPr>
-            <w:r/>
-            <w:r>
-              <w:rPr>
-                <w:rFonts w:ascii="맑은 고딕" w:hAnsi="맑은 고딕" w:eastAsia="맑은 고딕"/>
-                <w:b w:val="0"/>
-                <w:sz w:val="18"/>
-              </w:rPr>
-              <w:t>1.98%</w:t>
-            </w:r>
-          </w:p>
-        </w:tc>
-        <w:tc>
-          <w:tcPr>
-            <w:tcW w:type="dxa" w:w="1304"/>
-          </w:tcPr>
-          <w:p>
-            <w:pPr>
-              <w:spacing w:after="0" w:before="0"/>
-              <w:jc w:val="right"/>
-            </w:pPr>
-            <w:r/>
-            <w:r>
-              <w:rPr>
-                <w:rFonts w:ascii="맑은 고딕" w:hAnsi="맑은 고딕" w:eastAsia="맑은 고딕"/>
-                <w:b w:val="0"/>
-                <w:sz w:val="18"/>
-              </w:rPr>
-              <w:t>555,354원</w:t>
-            </w:r>
-          </w:p>
-        </w:tc>
-        <w:tc>
-          <w:tcPr>
-            <w:tcW w:type="dxa" w:w="680"/>
-          </w:tcPr>
-          <w:p>
-            <w:pPr>
-              <w:spacing w:after="0" w:before="0"/>
-              <w:jc w:val="center"/>
-            </w:pPr>
-            <w:r/>
-            <w:r>
-              <w:rPr>
-                <w:rFonts w:ascii="맑은 고딕" w:hAnsi="맑은 고딕" w:eastAsia="맑은 고딕"/>
-                <w:b w:val="0"/>
-                <w:sz w:val="18"/>
-              </w:rPr>
-              <w:t>18</w:t>
-            </w:r>
-          </w:p>
-        </w:tc>
-        <w:tc>
-          <w:tcPr>
-            <w:tcW w:type="dxa" w:w="1134"/>
-          </w:tcPr>
-          <w:p>
-            <w:pPr>
-              <w:spacing w:after="0" w:before="0"/>
-              <w:jc w:val="right"/>
-            </w:pPr>
-            <w:r/>
-            <w:r>
-              <w:rPr>
-                <w:rFonts w:ascii="맑은 고딕" w:hAnsi="맑은 고딕" w:eastAsia="맑은 고딕"/>
-                <w:b w:val="0"/>
-                <w:sz w:val="18"/>
-              </w:rPr>
-              <w:t>28,550원</w:t>
             </w:r>
           </w:p>
         </w:tc>
@@ -2527,7 +2540,7 @@
                 <w:b/>
                 <w:sz w:val="16"/>
               </w:rPr>
-              <w:t>전력기기·유틸리티</w:t>
+              <w:t>소재·에너지</w:t>
             </w:r>
           </w:p>
         </w:tc>
@@ -2546,7 +2559,7 @@
                 <w:b w:val="0"/>
                 <w:sz w:val="16"/>
               </w:rPr>
-              <w:t>두산에너빌리티 86,200원(1.04%)  LS ELECTRIC 194,700원(0.55%)  HD현대일렉트릭 700,000원(0.47%)  효성중공업 2,689,000원(0.47%)  두산 1,289,000원(0.39%)  한국전력 31,350원(0.38%)</w:t>
+              <w:t>POSCO홀딩스 332,000원(0.49%)  SK이노베이션 141,700원(0.45%)  고려아연 1,138,000원(0.45%)  HMM 20,650원(0.37%)  LG화학 271,500원(0.36%)  S-Oil 148,700원(0.31%)</w:t>
             </w:r>
           </w:p>
         </w:tc>
@@ -2567,7 +2580,7 @@
                 <w:b/>
                 <w:sz w:val="16"/>
               </w:rPr>
-              <w:t>조선·기자재</w:t>
+              <w:t>전력기기·유틸리티</w:t>
             </w:r>
           </w:p>
         </w:tc>
@@ -2586,47 +2599,7 @@
                 <w:b w:val="0"/>
                 <w:sz w:val="16"/>
               </w:rPr>
-              <w:t>HD현대중공업 453,500원(0.89%)  한화오션 82,400원(0.47%)  HD한국조선해양 339,000원(0.45%)  삼성중공업 20,700원(0.34%)  HD현대 225,000원(0.33%)  HD현대마린솔루션 232,000원(0.20%)</w:t>
-            </w:r>
-          </w:p>
-        </w:tc>
-      </w:tr>
-      <w:tr>
-        <w:tc>
-          <w:tcPr>
-            <w:tcW w:type="dxa" w:w="2041"/>
-          </w:tcPr>
-          <w:p>
-            <w:pPr>
-              <w:spacing w:after="0" w:before="0"/>
-            </w:pPr>
-            <w:r/>
-            <w:r>
-              <w:rPr>
-                <w:rFonts w:ascii="맑은 고딕" w:hAnsi="맑은 고딕" w:eastAsia="맑은 고딕"/>
-                <w:b/>
-                <w:sz w:val="16"/>
-              </w:rPr>
-              <w:t>에너지·상사·운송</w:t>
-            </w:r>
-          </w:p>
-        </w:tc>
-        <w:tc>
-          <w:tcPr>
-            <w:tcW w:type="dxa" w:w="8107"/>
-          </w:tcPr>
-          <w:p>
-            <w:pPr>
-              <w:spacing w:after="0" w:before="0"/>
-            </w:pPr>
-            <w:r/>
-            <w:r>
-              <w:rPr>
-                <w:rFonts w:ascii="맑은 고딕" w:hAnsi="맑은 고딕" w:eastAsia="맑은 고딕"/>
-                <w:b w:val="0"/>
-                <w:sz w:val="16"/>
-              </w:rPr>
-              <w:t>SK 550,000원(0.75%)  SK이노베이션 141,700원(0.45%)  HMM 20,650원(0.37%)  S-Oil 148,700원(0.31%)  대한항공 29,350원(0.20%)  GS 115,100원(0.20%)</w:t>
+              <w:t>두산에너빌리티 86,200원(1.04%)  LS ELECTRIC 194,700원(0.55%)  HD현대일렉트릭 700,000원(0.47%)  효성중공업 2,689,000원(0.47%)  한국전력 31,350원(0.38%)  산일전기 187,500원(0.11%)</w:t>
             </w:r>
           </w:p>
         </w:tc>
@@ -2687,7 +2660,7 @@
                 <w:b/>
                 <w:sz w:val="16"/>
               </w:rPr>
-              <w:t>방산·우주</w:t>
+              <w:t>조선·기자재</w:t>
             </w:r>
           </w:p>
         </w:tc>
@@ -2706,7 +2679,7 @@
                 <w:b w:val="0"/>
                 <w:sz w:val="16"/>
               </w:rPr>
-              <w:t>한화에어로스페이스 1,063,000원(1.03%)  LIG디펜스앤에어로스페이스 671,000원(0.28%)  현대로템 121,400원(0.25%)  한화시스템 69,700원(0.25%)  한국항공우주 129,000원(0.24%)  한화 137,100원(0.14%)</w:t>
+              <w:t>HD현대중공업 453,500원(0.89%)  한화오션 82,400원(0.47%)  HD한국조선해양 339,000원(0.45%)  삼성중공업 20,700원(0.34%)  HD현대마린솔루션 232,000원(0.20%)  한화엔진 47,800원(0.07%)</w:t>
             </w:r>
           </w:p>
         </w:tc>
@@ -2727,7 +2700,7 @@
                 <w:b/>
                 <w:sz w:val="16"/>
               </w:rPr>
-              <w:t>소재·화학·철강</w:t>
+              <w:t>지주 — 산업재·인프라</w:t>
             </w:r>
           </w:p>
         </w:tc>
@@ -2746,7 +2719,47 @@
                 <w:b w:val="0"/>
                 <w:sz w:val="16"/>
               </w:rPr>
-              <w:t>POSCO홀딩스 332,000원(0.49%)  고려아연 1,138,000원(0.45%)  LG화학 271,500원(0.36%)  한화솔루션 28,550원(0.12%)  현대제철 35,150원(0.09%)  SKC 87,300원(0.08%)</w:t>
+              <w:t>SK 550,000원(0.75%)  두산 1,289,000원(0.39%)  HD현대 225,000원(0.33%)  GS 115,100원(0.20%)  LS 303,500원(0.18%)  한진칼 138,100원(0.17%)</w:t>
+            </w:r>
+          </w:p>
+        </w:tc>
+      </w:tr>
+      <w:tr>
+        <w:tc>
+          <w:tcPr>
+            <w:tcW w:type="dxa" w:w="2041"/>
+          </w:tcPr>
+          <w:p>
+            <w:pPr>
+              <w:spacing w:after="0" w:before="0"/>
+            </w:pPr>
+            <w:r/>
+            <w:r>
+              <w:rPr>
+                <w:rFonts w:ascii="맑은 고딕" w:hAnsi="맑은 고딕" w:eastAsia="맑은 고딕"/>
+                <w:b/>
+                <w:sz w:val="16"/>
+              </w:rPr>
+              <w:t>방산·우주</w:t>
+            </w:r>
+          </w:p>
+        </w:tc>
+        <w:tc>
+          <w:tcPr>
+            <w:tcW w:type="dxa" w:w="8107"/>
+          </w:tcPr>
+          <w:p>
+            <w:pPr>
+              <w:spacing w:after="0" w:before="0"/>
+            </w:pPr>
+            <w:r/>
+            <w:r>
+              <w:rPr>
+                <w:rFonts w:ascii="맑은 고딕" w:hAnsi="맑은 고딕" w:eastAsia="맑은 고딕"/>
+                <w:b w:val="0"/>
+                <w:sz w:val="16"/>
+              </w:rPr>
+              <w:t>한화에어로스페이스 1,063,000원(1.03%)  LIG디펜스앤에어로스페이스 671,000원(0.28%)  현대로템 121,400원(0.25%)  한화시스템 69,700원(0.25%)  한국항공우주 129,000원(0.24%)  풍산 76,100원(0.04%)</w:t>
             </w:r>
           </w:p>
         </w:tc>
@@ -2780,7 +2793,7 @@
           <w:b w:val="0"/>
           <w:sz w:val="18"/>
         </w:rPr>
-        <w:t>담당 산업 6개, 인원 5명입니다. 가장 작은 소재·화학·철강은 팀장이 겸임합니다.</w:t>
+        <w:t>담당 산업 6개, 인원 5명이므로 팀장이 1개를 겸임한다. 지주 분리로 작아진 소재·화학·철강과 에너지·상사·운송을 「소재·에너지」로 합쳤다.</w:t>
       </w:r>
     </w:p>
     <w:p>
@@ -2793,7 +2806,7 @@
           <w:b/>
           <w:sz w:val="20"/>
         </w:rPr>
-        <w:t>다음 주 과제 — 담당 산업 스크리닝 (A4 1~2장, 세션 전날 자정)</w:t>
+        <w:t>과제 — 담당 산업 스크리닝  (A4 1~2장 · 마감 9월 22일 세션 전날 자정)</w:t>
       </w:r>
     </w:p>
     <w:p>
@@ -2806,7 +2819,7 @@
           <w:b w:val="0"/>
           <w:sz w:val="18"/>
         </w:rPr>
-        <w:t>1.  담당 산업 전 종목을 3개 지표로 줄 세운다 — 3개년 매출 CAGR · 최근 4분기 평균 OPM · ROE</w:t>
+        <w:t>1.  담당 산업 전 종목을 매출 CAGR(3년) · 영업이익률 · ROE 세 지표로 줄 세운다.</w:t>
       </w:r>
     </w:p>
     <w:p>
@@ -2819,7 +2832,7 @@
           <w:b w:val="0"/>
           <w:sz w:val="18"/>
         </w:rPr>
-        <w:t xml:space="preserve">     모든 숫자에 출처와 기준일을 단다. DART 사업보고서를 1순위로 쓴다.</w:t>
+        <w:t xml:space="preserve">     모든 수치에 출처와 기준일을 기재한다. 1순위 자료는 DART 사업보고서다.</w:t>
       </w:r>
     </w:p>
     <w:p>
@@ -2832,7 +2845,7 @@
           <w:b w:val="0"/>
           <w:sz w:val="18"/>
         </w:rPr>
-        <w:t>2.  상위 3종목을 고르고 각각 두 줄로 근거를 쓴다.</w:t>
+        <w:t>2.  상위 3종목을 선정하고 각각 두 줄로 근거를 기재한다.</w:t>
       </w:r>
     </w:p>
     <w:p>
@@ -2845,7 +2858,7 @@
           <w:b w:val="0"/>
           <w:sz w:val="18"/>
         </w:rPr>
-        <w:t>3.  탈락 5종목과 뺀 이유를 한 줄씩 쓴다.  "지표가 나빠서"는 사유가 아니다.</w:t>
+        <w:t>3.  탈락 5종목과 사유를 한 줄씩 기재한다. 해당 지표와 수치를 명시한다.</w:t>
       </w:r>
     </w:p>
     <w:p>
@@ -2858,7 +2871,20 @@
           <w:b w:val="0"/>
           <w:sz w:val="18"/>
         </w:rPr>
-        <w:t>4.  1주 가격을 확인한다 — 1주가 팀 예산의 20%를 넘는 종목을 표시한다.</w:t>
+        <w:t>4.  1주 가격이 팀 예산의 20%를 초과하는 종목을 표시한다.</w:t>
+      </w:r>
+    </w:p>
+    <w:p>
+      <w:pPr>
+        <w:spacing w:after="20" w:before="0"/>
+      </w:pPr>
+      <w:r>
+        <w:rPr>
+          <w:rFonts w:ascii="맑은 고딕" w:hAnsi="맑은 고딕" w:eastAsia="맑은 고딕"/>
+          <w:b w:val="0"/>
+          <w:sz w:val="18"/>
+        </w:rPr>
+        <w:t>5.  지주를 검토할 때는 같은 팀이 보유한 자회사와의 합산 노출을 함께 확인한다.</w:t>
       </w:r>
     </w:p>
     <w:p>
@@ -2871,7 +2897,7 @@
           <w:b/>
           <w:sz w:val="18"/>
         </w:rPr>
-        <w:t>금지 — 증권사 리포트를 논지의 근거로 쓰지 않는다. 목표주가를 인용하지 않는다.</w:t>
+        <w:t>증권사 리포트를 논지의 근거로 사용하지 않는다. 목표주가를 인용하지 않는다.</w:t>
       </w:r>
     </w:p>
     <w:p>
@@ -2885,7 +2911,7 @@
           <w:color w:val="990011"/>
           <w:sz w:val="18"/>
         </w:rPr>
-        <w:t>여기서 고른 3종목 중 하나를 10월 13일에 발제한다. 효성중공업(2,689,000원 · BM 0.47%)은 1주만 사도 한도를 넘어 매수할 수 없다.</w:t>
+        <w:t>스크리닝 결과로 팀 미니 IC에서 1라운드 발표 섹터를 정한다.  효성중공업(2,689,000원 · 지수 비중 0.47%)은 1주 매수만으로 한도를 초과한다.</w:t>
       </w:r>
     </w:p>
     <w:p>
@@ -3281,7 +3307,7 @@
                 <w:b w:val="0"/>
                 <w:sz w:val="18"/>
               </w:rPr>
-              <w:t>4.09%</w:t>
+              <w:t>3.87%</w:t>
             </w:r>
           </w:p>
         </w:tc>
@@ -3301,7 +3327,7 @@
                 <w:b w:val="0"/>
                 <w:sz w:val="18"/>
               </w:rPr>
-              <w:t>1,145,657원</w:t>
+              <w:t>1,083,543원</w:t>
             </w:r>
           </w:p>
         </w:tc>
@@ -3321,7 +3347,7 @@
                 <w:b w:val="0"/>
                 <w:sz w:val="18"/>
               </w:rPr>
-              <w:t>44</w:t>
+              <w:t>42</w:t>
             </w:r>
           </w:p>
         </w:tc>
@@ -3555,7 +3581,7 @@
                 <w:b w:val="0"/>
                 <w:sz w:val="18"/>
               </w:rPr>
-              <w:t>2.62%</w:t>
+              <w:t>2.01%</w:t>
             </w:r>
           </w:p>
         </w:tc>
@@ -3575,7 +3601,7 @@
                 <w:b w:val="0"/>
                 <w:sz w:val="18"/>
               </w:rPr>
-              <w:t>733,378원</w:t>
+              <w:t>561,975원</w:t>
             </w:r>
           </w:p>
         </w:tc>
@@ -3595,7 +3621,7 @@
                 <w:b w:val="0"/>
                 <w:sz w:val="18"/>
               </w:rPr>
-              <w:t>32</w:t>
+              <w:t>24</w:t>
             </w:r>
           </w:p>
         </w:tc>
@@ -3615,7 +3641,7 @@
                 <w:b w:val="0"/>
                 <w:sz w:val="18"/>
               </w:rPr>
-              <w:t>11,240원</w:t>
+              <w:t>15,120원</w:t>
             </w:r>
           </w:p>
         </w:tc>
@@ -3793,6 +3819,143 @@
           </w:p>
         </w:tc>
       </w:tr>
+      <w:tr>
+        <w:tc>
+          <w:tcPr>
+            <w:tcW w:type="dxa" w:w="2041"/>
+          </w:tcPr>
+          <w:p>
+            <w:pPr>
+              <w:spacing w:after="0" w:before="0"/>
+            </w:pPr>
+            <w:r/>
+            <w:r>
+              <w:rPr>
+                <w:rFonts w:ascii="맑은 고딕" w:hAnsi="맑은 고딕" w:eastAsia="맑은 고딕"/>
+                <w:b/>
+                <w:sz w:val="18"/>
+              </w:rPr>
+              <w:t>지주 — 내수·소비</w:t>
+            </w:r>
+          </w:p>
+        </w:tc>
+        <w:tc>
+          <w:tcPr>
+            <w:tcW w:type="dxa" w:w="907"/>
+          </w:tcPr>
+          <w:p>
+            <w:pPr>
+              <w:spacing w:after="0" w:before="0"/>
+              <w:jc w:val="center"/>
+            </w:pPr>
+            <w:r/>
+            <w:r>
+              <w:rPr>
+                <w:rFonts w:ascii="맑은 고딕" w:hAnsi="맑은 고딕" w:eastAsia="맑은 고딕"/>
+                <w:b w:val="0"/>
+                <w:sz w:val="18"/>
+              </w:rPr>
+              <w:t>0.83%</w:t>
+            </w:r>
+          </w:p>
+        </w:tc>
+        <w:tc>
+          <w:tcPr>
+            <w:tcW w:type="dxa" w:w="1304"/>
+          </w:tcPr>
+          <w:p>
+            <w:pPr>
+              <w:spacing w:after="0" w:before="0"/>
+              <w:jc w:val="right"/>
+            </w:pPr>
+            <w:r/>
+            <w:r>
+              <w:rPr>
+                <w:rFonts w:ascii="맑은 고딕" w:hAnsi="맑은 고딕" w:eastAsia="맑은 고딕"/>
+                <w:b w:val="0"/>
+                <w:sz w:val="18"/>
+              </w:rPr>
+              <w:t>233,516원</w:t>
+            </w:r>
+          </w:p>
+        </w:tc>
+        <w:tc>
+          <w:tcPr>
+            <w:tcW w:type="dxa" w:w="680"/>
+          </w:tcPr>
+          <w:p>
+            <w:pPr>
+              <w:spacing w:after="0" w:before="0"/>
+              <w:jc w:val="center"/>
+            </w:pPr>
+            <w:r/>
+            <w:r>
+              <w:rPr>
+                <w:rFonts w:ascii="맑은 고딕" w:hAnsi="맑은 고딕" w:eastAsia="맑은 고딕"/>
+                <w:b w:val="0"/>
+                <w:sz w:val="18"/>
+              </w:rPr>
+              <w:t>10</w:t>
+            </w:r>
+          </w:p>
+        </w:tc>
+        <w:tc>
+          <w:tcPr>
+            <w:tcW w:type="dxa" w:w="1134"/>
+          </w:tcPr>
+          <w:p>
+            <w:pPr>
+              <w:spacing w:after="0" w:before="0"/>
+              <w:jc w:val="right"/>
+            </w:pPr>
+            <w:r/>
+            <w:r>
+              <w:rPr>
+                <w:rFonts w:ascii="맑은 고딕" w:hAnsi="맑은 고딕" w:eastAsia="맑은 고딕"/>
+                <w:b w:val="0"/>
+                <w:sz w:val="18"/>
+              </w:rPr>
+              <w:t>11,240원</w:t>
+            </w:r>
+          </w:p>
+        </w:tc>
+        <w:tc>
+          <w:tcPr>
+            <w:tcW w:type="dxa" w:w="907"/>
+          </w:tcPr>
+          <w:p>
+            <w:pPr>
+              <w:spacing w:after="0" w:before="0"/>
+            </w:pPr>
+            <w:r/>
+            <w:r>
+              <w:rPr>
+                <w:rFonts w:ascii="맑은 고딕" w:hAnsi="맑은 고딕" w:eastAsia="맑은 고딕"/>
+                <w:b w:val="0"/>
+                <w:sz w:val="18"/>
+              </w:rPr>
+            </w:r>
+          </w:p>
+        </w:tc>
+        <w:tc>
+          <w:tcPr>
+            <w:tcW w:type="dxa" w:w="907"/>
+          </w:tcPr>
+          <w:p>
+            <w:pPr>
+              <w:spacing w:after="0" w:before="0"/>
+            </w:pPr>
+            <w:r/>
+            <w:r>
+              <w:rPr>
+                <w:rFonts w:ascii="맑은 고딕" w:hAnsi="맑은 고딕" w:eastAsia="맑은 고딕"/>
+                <w:b w:val="0"/>
+                <w:sz w:val="18"/>
+              </w:rPr>
+            </w:r>
+          </w:p>
+        </w:tc>
+      </w:tr>
     </w:tbl>
     <w:p>
       <w:pPr>
@@ -3897,7 +4060,7 @@
                 <w:b w:val="0"/>
                 <w:sz w:val="16"/>
               </w:rPr>
-              <w:t>삼성바이오로직스 1,412,000원(1.23%)  셀트리온 177,500원(0.78%)  알테오젠 260,000원(0.34%)  삼성에피스홀딩스 333,000원(0.16%)  한미약품 496,500원(0.12%)  SK바이오팜 78,100원(0.11%)</w:t>
+              <w:t>삼성바이오로직스 1,412,000원(1.23%)  셀트리온 177,500원(0.78%)  알테오젠 260,000원(0.34%)  한미약품 496,500원(0.12%)  SK바이오팜 78,100원(0.11%)  유한양행 79,300원(0.11%)</w:t>
             </w:r>
           </w:p>
         </w:tc>
@@ -3977,7 +4140,7 @@
                 <w:b w:val="0"/>
                 <w:sz w:val="16"/>
               </w:rPr>
-              <w:t>KT&amp;G 170,800원(0.33%)  LG 114,300원(0.32%)  에이피알 361,500원(0.25%)  삼양식품 1,277,000원(0.18%)  아모레퍼시픽 144,000원(0.16%)  코웨이 101,500원(0.13%)</w:t>
+              <w:t>KT&amp;G 170,800원(0.33%)  에이피알 361,500원(0.25%)  삼양식품 1,277,000원(0.18%)  아모레퍼시픽 144,000원(0.16%)  코웨이 101,500원(0.13%)  오리온 116,000원(0.09%)</w:t>
             </w:r>
           </w:p>
         </w:tc>
@@ -4022,6 +4185,46 @@
           </w:p>
         </w:tc>
       </w:tr>
+      <w:tr>
+        <w:tc>
+          <w:tcPr>
+            <w:tcW w:type="dxa" w:w="2041"/>
+          </w:tcPr>
+          <w:p>
+            <w:pPr>
+              <w:spacing w:after="0" w:before="0"/>
+            </w:pPr>
+            <w:r/>
+            <w:r>
+              <w:rPr>
+                <w:rFonts w:ascii="맑은 고딕" w:hAnsi="맑은 고딕" w:eastAsia="맑은 고딕"/>
+                <w:b/>
+                <w:sz w:val="16"/>
+              </w:rPr>
+              <w:t>지주 — 내수·소비</w:t>
+            </w:r>
+          </w:p>
+        </w:tc>
+        <w:tc>
+          <w:tcPr>
+            <w:tcW w:type="dxa" w:w="8107"/>
+          </w:tcPr>
+          <w:p>
+            <w:pPr>
+              <w:spacing w:after="0" w:before="0"/>
+            </w:pPr>
+            <w:r/>
+            <w:r>
+              <w:rPr>
+                <w:rFonts w:ascii="맑은 고딕" w:hAnsi="맑은 고딕" w:eastAsia="맑은 고딕"/>
+                <w:b w:val="0"/>
+                <w:sz w:val="16"/>
+              </w:rPr>
+              <w:t>LG 114,300원(0.32%)  삼성에피스홀딩스 333,000원(0.16%)  CJ 131,500원(0.07%)  한미사이언스 51,600원(0.07%)  롯데지주 24,950원(0.05%)  영원무역홀딩스 168,500원(0.04%)</w:t>
+            </w:r>
+          </w:p>
+        </w:tc>
+      </w:tr>
     </w:tbl>
     <w:p>
       <w:pPr>
@@ -4051,7 +4254,7 @@
           <w:b w:val="0"/>
           <w:sz w:val="18"/>
         </w:rPr>
-        <w:t>금융이 팀 몫의 절반(7.89%)이라 은행·지주 / 보험·증권으로 나눴습니다. 보험(IFRS17 CSM)과 무매출 바이오는 팀장이 봅니다.</w:t>
+        <w:t>담당 산업 6개, 인원 5명이므로 팀장이 1개를 겸임한다. 금융이 팀 몫의 절반이라 은행·지주 / 보험·증권으로 나눴다. 보험(IFRS17 CSM)과 매출 미발생 바이오는 팀장이 본다.</w:t>
       </w:r>
     </w:p>
     <w:p>
@@ -4064,7 +4267,7 @@
           <w:b/>
           <w:sz w:val="20"/>
         </w:rPr>
-        <w:t>다음 주 과제 — 담당 산업 스크리닝 (A4 1~2장, 세션 전날 자정)</w:t>
+        <w:t>과제 — 담당 산업 스크리닝  (A4 1~2장 · 마감 9월 22일 세션 전날 자정)</w:t>
       </w:r>
     </w:p>
     <w:p>
@@ -4077,7 +4280,7 @@
           <w:b w:val="0"/>
           <w:sz w:val="18"/>
         </w:rPr>
-        <w:t>1.  담당 산업 전 종목을 3개 지표로 줄 세운다 — 3개년 매출 CAGR · 최근 4분기 평균 OPM · ROE</w:t>
+        <w:t>1.  담당 산업 전 종목을 매출 CAGR(3년) · 영업이익률 · ROE 세 지표로 줄 세운다.</w:t>
       </w:r>
     </w:p>
     <w:p>
@@ -4090,7 +4293,7 @@
           <w:b w:val="0"/>
           <w:sz w:val="18"/>
         </w:rPr>
-        <w:t xml:space="preserve">     모든 숫자에 출처와 기준일을 단다. DART 사업보고서를 1순위로 쓴다.</w:t>
+        <w:t xml:space="preserve">     모든 수치에 출처와 기준일을 기재한다. 1순위 자료는 DART 사업보고서다.</w:t>
       </w:r>
     </w:p>
     <w:p>
@@ -4103,7 +4306,7 @@
           <w:b w:val="0"/>
           <w:sz w:val="18"/>
         </w:rPr>
-        <w:t>2.  상위 3종목을 고르고 각각 두 줄로 근거를 쓴다.</w:t>
+        <w:t>2.  상위 3종목을 선정하고 각각 두 줄로 근거를 기재한다.</w:t>
       </w:r>
     </w:p>
     <w:p>
@@ -4116,7 +4319,7 @@
           <w:b w:val="0"/>
           <w:sz w:val="18"/>
         </w:rPr>
-        <w:t>3.  탈락 5종목과 뺀 이유를 한 줄씩 쓴다.  "지표가 나빠서"는 사유가 아니다.</w:t>
+        <w:t>3.  탈락 5종목과 사유를 한 줄씩 기재한다. 해당 지표와 수치를 명시한다.</w:t>
       </w:r>
     </w:p>
     <w:p>
@@ -4129,7 +4332,20 @@
           <w:b w:val="0"/>
           <w:sz w:val="18"/>
         </w:rPr>
-        <w:t>4.  1주 가격을 확인한다 — 1주가 팀 예산의 20%를 넘는 종목을 표시한다.</w:t>
+        <w:t>4.  1주 가격이 팀 예산의 20%를 초과하는 종목을 표시한다.</w:t>
+      </w:r>
+    </w:p>
+    <w:p>
+      <w:pPr>
+        <w:spacing w:after="20" w:before="0"/>
+      </w:pPr>
+      <w:r>
+        <w:rPr>
+          <w:rFonts w:ascii="맑은 고딕" w:hAnsi="맑은 고딕" w:eastAsia="맑은 고딕"/>
+          <w:b w:val="0"/>
+          <w:sz w:val="18"/>
+        </w:rPr>
+        <w:t>5.  지주를 검토할 때는 같은 팀이 보유한 자회사와의 합산 노출을 함께 확인한다.</w:t>
       </w:r>
     </w:p>
     <w:p>
@@ -4142,7 +4358,7 @@
           <w:b/>
           <w:sz w:val="18"/>
         </w:rPr>
-        <w:t>금지 — 증권사 리포트를 논지의 근거로 쓰지 않는다. 목표주가를 인용하지 않는다.</w:t>
+        <w:t>증권사 리포트를 논지의 근거로 사용하지 않는다. 목표주가를 인용하지 않는다.</w:t>
       </w:r>
     </w:p>
     <w:p>
@@ -4156,7 +4372,7 @@
           <w:color w:val="990011"/>
           <w:sz w:val="18"/>
         </w:rPr>
-        <w:t>여기서 고른 3종목 중 하나를 10월 13일에 발제한다. 효성중공업(2,689,000원 · BM 0.47%)은 1주만 사도 한도를 넘어 매수할 수 없다.</w:t>
+        <w:t>스크리닝 결과로 팀 미니 IC에서 1라운드 발표 섹터를 정한다.  효성중공업(2,689,000원 · 지수 비중 0.47%)은 1주 매수만으로 한도를 초과한다.</w:t>
       </w:r>
     </w:p>
     <w:sectPr>

</xml_diff>